<commit_message>
Update unsaved story edits and 00_Story_Notes
</commit_message>
<xml_diff>
--- a/assets/text/01_Introductory_Scene_Script.docx
+++ b/assets/text/01_Introductory_Scene_Script.docx
@@ -142,6 +142,24 @@
           <w:sz w:val="22"/>
           <w:szCs w:val="22"/>
         </w:rPr>
+        <w:t>//</w:t>
+      </w:r>
+    </w:p>
+    <w:p>
+      <w:pPr>
+        <w:pStyle w:val="BodyText"/>
+        <w:rPr>
+          <w:rFonts w:ascii="Courier New" w:hAnsi="Courier New" w:eastAsia="Courier New" w:cs="Courier New"/>
+          <w:sz w:val="22"/>
+          <w:szCs w:val="22"/>
+        </w:rPr>
+      </w:pPr>
+      <w:r>
+        <w:rPr>
+          <w:rFonts w:eastAsia="Courier New" w:cs="Courier New" w:ascii="Courier New" w:hAnsi="Courier New"/>
+          <w:sz w:val="22"/>
+          <w:szCs w:val="22"/>
+        </w:rPr>
         <w:t>Or so it used to be. Now, the people who had once looked at the imposing gates of the manor with envy, admiration and pride, see nothing but a source of danger, fear and discomfort. Some thought it a bit odd. The Ashbrook family had all left this place, one way or another, and supposedly, the manor had been abandoned for more than a decade. What was there to fear?</w:t>
       </w:r>
     </w:p>
@@ -160,6 +178,24 @@
           <w:sz w:val="22"/>
           <w:szCs w:val="22"/>
         </w:rPr>
+        <w:t>//</w:t>
+      </w:r>
+    </w:p>
+    <w:p>
+      <w:pPr>
+        <w:pStyle w:val="BodyText"/>
+        <w:rPr>
+          <w:rFonts w:ascii="Courier New" w:hAnsi="Courier New" w:eastAsia="Courier New" w:cs="Courier New"/>
+          <w:sz w:val="22"/>
+          <w:szCs w:val="22"/>
+        </w:rPr>
+      </w:pPr>
+      <w:r>
+        <w:rPr>
+          <w:rFonts w:eastAsia="Courier New" w:cs="Courier New" w:ascii="Courier New" w:hAnsi="Courier New"/>
+          <w:sz w:val="22"/>
+          <w:szCs w:val="22"/>
+        </w:rPr>
         <w:t>Of course, the townspeople who remained from the days of the Ashbrook family’s prosperity would find that to be a truly silly question. After all, the manor had never been abandoned. Not completely. Something had been residing in that place to this day. Someone.</w:t>
       </w:r>
     </w:p>
@@ -178,6 +214,24 @@
           <w:sz w:val="22"/>
           <w:szCs w:val="22"/>
         </w:rPr>
+        <w:t>//</w:t>
+      </w:r>
+    </w:p>
+    <w:p>
+      <w:pPr>
+        <w:pStyle w:val="BodyText"/>
+        <w:rPr>
+          <w:rFonts w:ascii="Courier New" w:hAnsi="Courier New" w:eastAsia="Courier New" w:cs="Courier New"/>
+          <w:sz w:val="22"/>
+          <w:szCs w:val="22"/>
+        </w:rPr>
+      </w:pPr>
+      <w:r>
+        <w:rPr>
+          <w:rFonts w:eastAsia="Courier New" w:cs="Courier New" w:ascii="Courier New" w:hAnsi="Courier New"/>
+          <w:sz w:val="22"/>
+          <w:szCs w:val="22"/>
+        </w:rPr>
         <w:t xml:space="preserve">The name of the Lady of the Ashworth manor, Eleanor Ashworth is spoken in hushed whispers and resigned sighs amongst everyone in the town. </w:t>
       </w:r>
       <w:r>
@@ -186,8 +240,36 @@
           <w:sz w:val="22"/>
           <w:szCs w:val="22"/>
         </w:rPr>
-        <w:t xml:space="preserve">Stories of missing people, seen approaching her manor days before. Gossip of a miserable child who had passed away, never seeing the world past the confines of his home, all under that woman’s supervision. </w:t>
-      </w:r>
+        <w:t>Stories of missing people, seen approaching her manor days before. Gossip of a miserable child who had passed away, never seeing the world past the confines of his home, all under that woman’s supervision.</w:t>
+      </w:r>
+    </w:p>
+    <w:p>
+      <w:pPr>
+        <w:pStyle w:val="BodyText"/>
+        <w:rPr>
+          <w:rFonts w:ascii="Courier New" w:hAnsi="Courier New" w:eastAsia="Courier New" w:cs="Courier New"/>
+          <w:sz w:val="22"/>
+          <w:szCs w:val="22"/>
+        </w:rPr>
+      </w:pPr>
+      <w:r>
+        <w:rPr>
+          <w:rFonts w:eastAsia="Courier New" w:cs="Courier New" w:ascii="Courier New" w:hAnsi="Courier New"/>
+          <w:sz w:val="22"/>
+          <w:szCs w:val="22"/>
+        </w:rPr>
+        <w:t>//</w:t>
+      </w:r>
+    </w:p>
+    <w:p>
+      <w:pPr>
+        <w:pStyle w:val="BodyText"/>
+        <w:rPr>
+          <w:rFonts w:ascii="Courier New" w:hAnsi="Courier New" w:eastAsia="Courier New" w:cs="Courier New"/>
+          <w:sz w:val="22"/>
+          <w:szCs w:val="22"/>
+        </w:rPr>
+      </w:pPr>
       <w:r>
         <w:rPr>
           <w:rFonts w:eastAsia="Courier New" w:cs="Courier New" w:ascii="Courier New" w:hAnsi="Courier New"/>
@@ -244,6 +326,24 @@
           <w:sz w:val="22"/>
           <w:szCs w:val="22"/>
         </w:rPr>
+        <w:t>//</w:t>
+      </w:r>
+    </w:p>
+    <w:p>
+      <w:pPr>
+        <w:pStyle w:val="BodyText"/>
+        <w:rPr>
+          <w:rFonts w:ascii="Courier New" w:hAnsi="Courier New" w:eastAsia="Courier New" w:cs="Courier New"/>
+          <w:sz w:val="22"/>
+          <w:szCs w:val="22"/>
+        </w:rPr>
+      </w:pPr>
+      <w:r>
+        <w:rPr>
+          <w:rFonts w:eastAsia="Courier New" w:cs="Courier New" w:ascii="Courier New" w:hAnsi="Courier New"/>
+          <w:sz w:val="22"/>
+          <w:szCs w:val="22"/>
+        </w:rPr>
         <w:t xml:space="preserve">Well, </w:t>
       </w:r>
       <w:r>
@@ -253,6 +353,24 @@
           <w:szCs w:val="22"/>
         </w:rPr>
         <w:t>most of them at least. As for the ones that do... Haha... I hope you find the manor welcoming to your tastes. You won’t be leaving any time soon after all.</w:t>
+      </w:r>
+    </w:p>
+    <w:p>
+      <w:pPr>
+        <w:pStyle w:val="BodyText"/>
+        <w:rPr>
+          <w:rFonts w:ascii="Courier New" w:hAnsi="Courier New" w:eastAsia="Courier New" w:cs="Courier New"/>
+          <w:sz w:val="22"/>
+          <w:szCs w:val="22"/>
+        </w:rPr>
+      </w:pPr>
+      <w:r>
+        <w:rPr>
+          <w:rFonts w:eastAsia="Courier New" w:cs="Courier New" w:ascii="Courier New" w:hAnsi="Courier New"/>
+          <w:sz w:val="22"/>
+          <w:szCs w:val="22"/>
+        </w:rPr>
+        <w:t>//</w:t>
       </w:r>
     </w:p>
     <w:p>

</xml_diff>